<commit_message>
Tehty testia.py, jolla voi testata laskun tekemistä
</commit_message>
<xml_diff>
--- a/docs/Laskupohja.docx
+++ b/docs/Laskupohja.docx
@@ -385,6 +385,79 @@
                 <w:lang w:val="fi-FI"/>
               </w:rPr>
             </w:pPr>
+            <w:r>
+              <w:rPr>
+                <w:rFonts w:asciiTheme="majorHAnsi" w:hAnsiTheme="majorHAnsi"/>
+                <w:b/>
+                <w:color w:val="000000" w:themeColor="text1"/>
+                <w:sz w:val="22"/>
+                <w:szCs w:val="22"/>
+                <w:lang w:val="fi-FI"/>
+              </w:rPr>
+              <w:t xml:space="preserve">Viitenumero: </w:t>
+            </w:r>
+            <w:proofErr w:type="gramStart"/>
+            <w:r>
+              <w:rPr>
+                <w:rFonts w:asciiTheme="majorHAnsi" w:hAnsiTheme="majorHAnsi"/>
+                <w:b/>
+                <w:color w:val="000000" w:themeColor="text1"/>
+                <w:sz w:val="22"/>
+                <w:szCs w:val="22"/>
+                <w:lang w:val="fi-FI"/>
+              </w:rPr>
+              <w:t xml:space="preserve">{{ </w:t>
+            </w:r>
+            <w:proofErr w:type="spellStart"/>
+            <w:r>
+              <w:rPr>
+                <w:rFonts w:asciiTheme="majorHAnsi" w:hAnsiTheme="majorHAnsi"/>
+                <w:b/>
+                <w:color w:val="000000" w:themeColor="text1"/>
+                <w:sz w:val="22"/>
+                <w:szCs w:val="22"/>
+                <w:lang w:val="fi-FI"/>
+              </w:rPr>
+              <w:t>reference</w:t>
+            </w:r>
+            <w:proofErr w:type="spellEnd"/>
+            <w:proofErr w:type="gramEnd"/>
+            <w:r>
+              <w:rPr>
+                <w:rFonts w:asciiTheme="majorHAnsi" w:hAnsiTheme="majorHAnsi"/>
+                <w:b/>
+                <w:color w:val="000000" w:themeColor="text1"/>
+                <w:sz w:val="22"/>
+                <w:szCs w:val="22"/>
+                <w:lang w:val="fi-FI"/>
+              </w:rPr>
+              <w:t xml:space="preserve"> }}</w:t>
+            </w:r>
+          </w:p>
+          <w:p>
+            <w:pPr>
+              <w:pStyle w:val="Slogan"/>
+              <w:spacing w:line="276" w:lineRule="auto"/>
+              <w:rPr>
+                <w:rFonts w:asciiTheme="majorHAnsi" w:hAnsiTheme="majorHAnsi"/>
+                <w:b/>
+                <w:color w:val="000000" w:themeColor="text1"/>
+                <w:sz w:val="22"/>
+                <w:szCs w:val="22"/>
+                <w:lang w:val="fi-FI"/>
+              </w:rPr>
+            </w:pPr>
+            <w:r>
+              <w:rPr>
+                <w:rFonts w:asciiTheme="majorHAnsi" w:hAnsiTheme="majorHAnsi"/>
+                <w:b/>
+                <w:color w:val="000000" w:themeColor="text1"/>
+                <w:sz w:val="22"/>
+                <w:szCs w:val="22"/>
+                <w:lang w:val="fi-FI"/>
+              </w:rPr>
+              <w:t>Maksettaessa käytettävä tätä viitenumeroa</w:t>
+            </w:r>
           </w:p>
         </w:tc>
         <w:tc>
@@ -973,6 +1046,90 @@
                 <w:lang w:val="fi-FI"/>
               </w:rPr>
               <w:t>}</w:t>
+            </w:r>
+          </w:p>
+          <w:p>
+            <w:pPr>
+              <w:pStyle w:val="DateandNumber"/>
+              <w:tabs>
+                <w:tab w:val="left" w:pos="227"/>
+                <w:tab w:val="right" w:pos="3302"/>
+              </w:tabs>
+              <w:jc w:val="left"/>
+              <w:rPr>
+                <w:rFonts w:asciiTheme="majorHAnsi" w:hAnsiTheme="majorHAnsi"/>
+                <w:i/>
+                <w:color w:val="000000" w:themeColor="text1"/>
+                <w:sz w:val="22"/>
+                <w:szCs w:val="22"/>
+                <w:lang w:val="fi-FI"/>
+              </w:rPr>
+            </w:pPr>
+          </w:p>
+          <w:p>
+            <w:pPr>
+              <w:pStyle w:val="DateandNumber"/>
+              <w:tabs>
+                <w:tab w:val="left" w:pos="227"/>
+                <w:tab w:val="right" w:pos="3302"/>
+              </w:tabs>
+              <w:jc w:val="left"/>
+              <w:rPr>
+                <w:rFonts w:asciiTheme="majorHAnsi" w:hAnsiTheme="majorHAnsi"/>
+                <w:i/>
+                <w:color w:val="000000" w:themeColor="text1"/>
+                <w:sz w:val="22"/>
+                <w:szCs w:val="22"/>
+                <w:lang w:val="fi-FI"/>
+              </w:rPr>
+            </w:pPr>
+            <w:proofErr w:type="gramStart"/>
+            <w:r>
+              <w:rPr>
+                <w:rFonts w:asciiTheme="majorHAnsi" w:hAnsiTheme="majorHAnsi"/>
+                <w:i/>
+                <w:color w:val="000000" w:themeColor="text1"/>
+                <w:sz w:val="22"/>
+                <w:szCs w:val="22"/>
+                <w:lang w:val="fi-FI"/>
+              </w:rPr>
+              <w:t xml:space="preserve">{{ </w:t>
+            </w:r>
+            <w:proofErr w:type="spellStart"/>
+            <w:r>
+              <w:rPr>
+                <w:rFonts w:asciiTheme="majorHAnsi" w:hAnsiTheme="majorHAnsi"/>
+                <w:i/>
+                <w:color w:val="000000" w:themeColor="text1"/>
+                <w:sz w:val="22"/>
+                <w:szCs w:val="22"/>
+                <w:lang w:val="fi-FI"/>
+              </w:rPr>
+              <w:t>payer</w:t>
+            </w:r>
+            <w:proofErr w:type="gramEnd"/>
+            <w:r>
+              <w:rPr>
+                <w:rFonts w:asciiTheme="majorHAnsi" w:hAnsiTheme="majorHAnsi"/>
+                <w:i/>
+                <w:color w:val="000000" w:themeColor="text1"/>
+                <w:sz w:val="22"/>
+                <w:szCs w:val="22"/>
+                <w:lang w:val="fi-FI"/>
+              </w:rPr>
+              <w:t>_reference</w:t>
+            </w:r>
+            <w:proofErr w:type="spellEnd"/>
+            <w:r>
+              <w:rPr>
+                <w:rFonts w:asciiTheme="majorHAnsi" w:hAnsiTheme="majorHAnsi"/>
+                <w:i/>
+                <w:color w:val="000000" w:themeColor="text1"/>
+                <w:sz w:val="22"/>
+                <w:szCs w:val="22"/>
+                <w:lang w:val="fi-FI"/>
+              </w:rPr>
+              <w:t xml:space="preserve"> }}</w:t>
             </w:r>
             <w:r>
               <w:rPr>
@@ -1370,8 +1527,18 @@
               </w:rPr>
               <w:t>price</w:t>
             </w:r>
+            <w:proofErr w:type="gramEnd"/>
+            <w:r>
+              <w:rPr>
+                <w:rFonts w:asciiTheme="majorHAnsi" w:hAnsiTheme="majorHAnsi"/>
+                <w:color w:val="000000" w:themeColor="text1"/>
+                <w:sz w:val="22"/>
+                <w:szCs w:val="22"/>
+                <w:lang w:val="fi-FI"/>
+              </w:rPr>
+              <w:t>_a</w:t>
+            </w:r>
             <w:proofErr w:type="spellEnd"/>
-            <w:proofErr w:type="gramEnd"/>
             <w:r>
               <w:rPr>
                 <w:rFonts w:asciiTheme="majorHAnsi" w:hAnsiTheme="majorHAnsi"/>
@@ -1447,20 +1614,10 @@
                 <w:szCs w:val="22"/>
                 <w:lang w:val="fi-FI"/>
               </w:rPr>
-              <w:t>tot</w:t>
-            </w:r>
+              <w:t>price</w:t>
+            </w:r>
+            <w:proofErr w:type="spellEnd"/>
             <w:proofErr w:type="gramEnd"/>
-            <w:r>
-              <w:rPr>
-                <w:rFonts w:asciiTheme="majorHAnsi" w:hAnsiTheme="majorHAnsi"/>
-                <w:color w:val="000000" w:themeColor="text1"/>
-                <w:sz w:val="22"/>
-                <w:szCs w:val="22"/>
-                <w:lang w:val="fi-FI"/>
-              </w:rPr>
-              <w:t>_price</w:t>
-            </w:r>
-            <w:proofErr w:type="spellEnd"/>
             <w:r>
               <w:rPr>
                 <w:rFonts w:asciiTheme="majorHAnsi" w:hAnsiTheme="majorHAnsi"/>
@@ -1580,39 +1737,29 @@
                 <w:szCs w:val="22"/>
                 <w:lang w:val="fi-FI"/>
               </w:rPr>
+              <w:t xml:space="preserve"> (</w:t>
+            </w:r>
+            <w:proofErr w:type="gramStart"/>
+            <w:r>
+              <w:rPr>
+                <w:rFonts w:asciiTheme="majorHAnsi" w:hAnsiTheme="majorHAnsi"/>
+                <w:color w:val="000000" w:themeColor="text1"/>
+                <w:sz w:val="22"/>
+                <w:szCs w:val="22"/>
+                <w:lang w:val="fi-FI"/>
+              </w:rPr>
+              <w:t>{{</w:t>
+            </w:r>
+            <w:r>
+              <w:rPr>
+                <w:rFonts w:asciiTheme="majorHAnsi" w:hAnsiTheme="majorHAnsi"/>
+                <w:color w:val="000000" w:themeColor="text1"/>
+                <w:sz w:val="22"/>
+                <w:szCs w:val="22"/>
+                <w:lang w:val="fi-FI"/>
+              </w:rPr>
               <w:t xml:space="preserve"> </w:t>
             </w:r>
-            <w:proofErr w:type="gramStart"/>
-            <w:r>
-              <w:rPr>
-                <w:rFonts w:asciiTheme="majorHAnsi" w:hAnsiTheme="majorHAnsi"/>
-                <w:color w:val="000000" w:themeColor="text1"/>
-                <w:sz w:val="22"/>
-                <w:szCs w:val="22"/>
-                <w:lang w:val="fi-FI"/>
-              </w:rPr>
-              <w:t>(</w:t>
-            </w:r>
-            <w:r>
-              <w:rPr>
-                <w:rFonts w:asciiTheme="majorHAnsi" w:hAnsiTheme="majorHAnsi"/>
-                <w:color w:val="000000" w:themeColor="text1"/>
-                <w:sz w:val="22"/>
-                <w:szCs w:val="22"/>
-                <w:lang w:val="fi-FI"/>
-              </w:rPr>
-              <w:t xml:space="preserve"> </w:t>
-            </w:r>
-            <w:r>
-              <w:rPr>
-                <w:rFonts w:asciiTheme="majorHAnsi" w:hAnsiTheme="majorHAnsi"/>
-                <w:color w:val="000000" w:themeColor="text1"/>
-                <w:sz w:val="22"/>
-                <w:szCs w:val="22"/>
-                <w:lang w:val="fi-FI"/>
-              </w:rPr>
-              <w:t xml:space="preserve">{{ </w:t>
-            </w:r>
             <w:proofErr w:type="spellStart"/>
             <w:r>
               <w:rPr>
@@ -1633,18 +1780,7 @@
                 <w:szCs w:val="22"/>
                 <w:lang w:val="fi-FI"/>
               </w:rPr>
-              <w:t>_</w:t>
-            </w:r>
-            <w:proofErr w:type="gramStart"/>
-            <w:r>
-              <w:rPr>
-                <w:rFonts w:asciiTheme="majorHAnsi" w:hAnsiTheme="majorHAnsi"/>
-                <w:color w:val="000000" w:themeColor="text1"/>
-                <w:sz w:val="22"/>
-                <w:szCs w:val="22"/>
-                <w:lang w:val="fi-FI"/>
-              </w:rPr>
-              <w:t>perc</w:t>
+              <w:t>_perc</w:t>
             </w:r>
             <w:proofErr w:type="spellEnd"/>
             <w:r>
@@ -1655,28 +1791,7 @@
                 <w:szCs w:val="22"/>
                 <w:lang w:val="fi-FI"/>
               </w:rPr>
-              <w:t xml:space="preserve"> }</w:t>
-            </w:r>
-            <w:proofErr w:type="gramEnd"/>
-            <w:r>
-              <w:rPr>
-                <w:rFonts w:asciiTheme="majorHAnsi" w:hAnsiTheme="majorHAnsi"/>
-                <w:color w:val="000000" w:themeColor="text1"/>
-                <w:sz w:val="22"/>
-                <w:szCs w:val="22"/>
-                <w:lang w:val="fi-FI"/>
-              </w:rPr>
-              <w:t>}</w:t>
-            </w:r>
-            <w:r>
-              <w:rPr>
-                <w:rFonts w:asciiTheme="majorHAnsi" w:hAnsiTheme="majorHAnsi"/>
-                <w:color w:val="000000" w:themeColor="text1"/>
-                <w:sz w:val="22"/>
-                <w:szCs w:val="22"/>
-                <w:lang w:val="fi-FI"/>
-              </w:rPr>
-              <w:t xml:space="preserve"> </w:t>
+              <w:t xml:space="preserve"> }}</w:t>
             </w:r>
             <w:r>
               <w:rPr>

</xml_diff>